<commit_message>
Update gap-analysis doc for §30 mobile screen and §35 alerting layer
Revision 3: §30 (post-call notes) and §35 (alerting) both move to Done
now that the mobile screen and the alerting layer exist. Executive
summary, build-sequence table, and QA-coverage row updated to match
(178 -> 197 automated checks, 9 -> 10 suites), plus a note on the two
real bugs the alerting verification work found and fixed in
call:invite.
</commit_message>
<xml_diff>
--- a/docs/Command_Centre_Epic_Gap_Analysis.docx
+++ b/docs/Command_Centre_Epic_Gap_Analysis.docx
@@ -64,7 +64,7 @@
           <w:sz w:val="20"/>
           <w:szCs w:val="20"/>
         </w:rPr>
-        <w:t xml:space="preserve">Revision 2 -- updated after two rounds of gap-closing work (backend/protocol-testable items). Original analysis and status are preserved below; changed rows are called out explicitly rather than silently rewritten.</w:t>
+        <w:t xml:space="preserve">Revision 3 -- updated after three rounds of gap-closing work (backend/protocol-testable items, plus the one mobile screen that had no native/device dependency). Original analysis and status are preserved below; changed rows are called out explicitly rather than silently rewritten.</w:t>
       </w:r>
     </w:p>
     <w:p>
@@ -121,7 +121,7 @@
           <w:sz w:val="22"/>
           <w:szCs w:val="22"/>
         </w:rPr>
-        <w:t xml:space="preserve">Since the original analysis, two rounds of backend/protocol-testable work closed the majority of the non-native gaps: role/permission model with a configurable role list (§6, partial -- tenant enforcement and the appointment-vs-assignment decision remain open), the full epic call-state vocabulary and single-active-call locking (§13, §19), the audio-only-fallback compliance risk (§21, now gated off by default with distinct audit logging -- no longer a conflict), the audit-schema expansion including platform tracking (§29), post-call notes &amp; outcome (§30), missed-call messaging (§31), structured analytics events (§35/§36), entry-point button states (§7), a network-quality indicator (§23, partial), calling-experience polish -- ringing timer, speaker/earpiece routing, front/rear camera switch (§10/§22, partial), and a call-session token distinct from the JWT (§28, partial). All of it is covered by 178 automated checks against a real backend (plus a Node-only unit suite for pure client logic), run clean before each round was called done.</w:t>
+        <w:t xml:space="preserve">Since the original analysis, three rounds of work closed the majority of the non-native gaps: role/permission model with a configurable role list (§6, partial -- tenant enforcement and the appointment-vs-assignment decision remain open), the full epic call-state vocabulary and single-active-call locking (§13, §19), the audio-only-fallback compliance risk (§21, now gated off by default with distinct audit logging -- no longer a conflict), the audit-schema expansion including platform tracking (§29), post-call notes &amp; outcome including the mobile screen (§30), missed-call messaging (§31), structured analytics events plus an alerting layer on top of them (§35/§36), entry-point button states (§7), a network-quality indicator (§23, partial), calling-experience polish -- ringing timer, speaker/earpiece routing, front/rear camera switch (§10/§22, partial), and a call-session token distinct from the JWT (§28, partial). All of it is covered by 197 automated checks against a real backend (plus a Node-only unit suite for pure client logic), run clean before each round was called done. Building the alerting layer’s own verification also surfaced and fixed two real, previously-unguarded crash bugs in the call:invite signaling handler (a missing callee id and a malformed one both threw unhandled exceptions instead of a clean rejection) -- exactly the kind of thing this section of the epic exists to catch.</w:t>
       </w:r>
     </w:p>
     <w:p>
@@ -188,7 +188,7 @@
           <w:sz w:val="22"/>
           <w:szCs w:val="22"/>
         </w:rPr>
-        <w:t xml:space="preserve">Smaller loose ends: tenant access-rule enforcement (§28’s other half -- the model exists, isn’t enforced against a real multi-tenant dataset yet), error-message copy reconciliation against the epic’s exact wording (§32 -- blocked on having that literal text), a mobile post-call-notes screen (§30 -- the API exists, no UI yet), and alerting on top of the structured logging that now exists (§35).</w:t>
+        <w:t xml:space="preserve">Smaller loose ends: tenant access-rule enforcement (§28’s other half -- the model exists, isn’t enforced against a real multi-tenant dataset yet) and error-message copy reconciliation against the epic’s exact wording (§32 -- blocked on having that literal text, not on effort).</w:t>
       </w:r>
     </w:p>
     <w:p>
@@ -3281,7 +3281,7 @@
                 <w:sz w:val="20"/>
                 <w:szCs w:val="20"/>
               </w:rPr>
-              <w:t xml:space="preserve">UPDATED: PATCH /calls/{id}/notes (notes, an outcome enum, follow_up_required) implemented, restricted to participants and to after the call has ended. Web client has a skip-able modal on every call end. Mobile has the API call wired up but no screen yet.</w:t>
+              <w:t xml:space="preserve">UPDATED: PATCH /calls/{id}/notes (notes, an outcome enum, follow_up_required) implemented, restricted to participants and to after the call has ended. Web client has a skip-able modal on every call end; mobile now has the matching screen too (doctor side, shown only after a call that actually connected -- a call that never connected has nothing to note).</w:t>
             </w:r>
           </w:p>
         </w:tc>
@@ -3302,11 +3302,11 @@
                 <w:rFonts w:ascii="Calibri" w:cs="Calibri" w:eastAsia="Calibri" w:hAnsi="Calibri"/>
                 <w:b/>
                 <w:bCs/>
-                <w:color w:val="BF8F00"/>
-                <w:sz w:val="20"/>
-                <w:szCs w:val="20"/>
-              </w:rPr>
-              <w:t xml:space="preserve">Partial</w:t>
+                <w:color w:val="2E7D32"/>
+                <w:sz w:val="20"/>
+                <w:szCs w:val="20"/>
+              </w:rPr>
+              <w:t xml:space="preserve">Done</w:t>
             </w:r>
           </w:p>
         </w:tc>
@@ -3802,7 +3802,7 @@
                 <w:sz w:val="20"/>
                 <w:szCs w:val="20"/>
               </w:rPr>
-              <w:t xml:space="preserve">UPDATED: every call lifecycle transition now emits a structured log line plus a document in a queryable analytics_events_collection (app/analytics.py), best-effort so a logging failure never blocks signaling. Still no alerting layer on top of it.</w:t>
+              <w:t xml:space="preserve">UPDATED: every call lifecycle transition emits a structured log line plus a document in a queryable analytics_events_collection (app/analytics.py). An alerting layer now sits on top of it (app/alerting.py): a genuine operational failure -- an unhandled exception in signaling message handling, an analytics DB write failure -- always logs at ERROR and persists to a queryable alerts collection, and optionally pushes to a webhook (Slack-compatible payload) if one is configured. Deliberately no threshold/anomaly alerting (e.g. "N failures in 5 minutes") -- that needs tuning against real production traffic this build has never seen. No external paging integration (PagerDuty etc.) confirmed, since none was specified -- the webhook is a generic, self-hostable "tell someone" mechanism instead.</w:t>
             </w:r>
           </w:p>
         </w:tc>
@@ -3824,11 +3824,11 @@
                 <w:rFonts w:ascii="Calibri" w:cs="Calibri" w:eastAsia="Calibri" w:hAnsi="Calibri"/>
                 <w:b/>
                 <w:bCs/>
-                <w:color w:val="BF8F00"/>
-                <w:sz w:val="20"/>
-                <w:szCs w:val="20"/>
-              </w:rPr>
-              <w:t xml:space="preserve">Partial</w:t>
+                <w:color w:val="2E7D32"/>
+                <w:sz w:val="20"/>
+                <w:szCs w:val="20"/>
+              </w:rPr>
+              <w:t xml:space="preserve">Done</w:t>
             </w:r>
           </w:p>
         </w:tc>
@@ -4010,7 +4010,7 @@
                 <w:sz w:val="20"/>
                 <w:szCs w:val="20"/>
               </w:rPr>
-              <w:t xml:space="preserve">UPDATED: automated coverage roughly tripled -- 178 checks across 9 suites now cover single-active-call locking, audit-field population, post-call notes, analytics events, network-quality relay, and the call-session token, in addition to the original basic-call-flow/multi-device/reconnection coverage. Platform-lifecycle, cellular-interruption, hardware, and BLE scenarios remain uncovered -- they need real devices and the native work above, which automated scripts can’t substitute for.</w:t>
+              <w:t xml:space="preserve">UPDATED: automated coverage now at 197 checks across 10 suites, covering single-active-call locking, audit-field population, post-call notes, analytics events, network-quality relay, the call-session token, and the alerting layer (including a live-fired unhandled-exception test against the real backend), in addition to the original basic-call-flow/multi-device/reconnection coverage. The mobile post-call-notes screen (§30) was checked via TypeScript type-checking and manual trace only -- no device to click through it on. Platform-lifecycle, cellular-interruption, hardware, and BLE scenarios remain uncovered -- they need real devices and the native work above, which automated scripts can’t substitute for.</w:t>
             </w:r>
           </w:p>
         </w:tc>
@@ -4325,7 +4325,7 @@
                 <w:sz w:val="20"/>
                 <w:szCs w:val="20"/>
               </w:rPr>
-              <w:t xml:space="preserve">DONE, mostly -- Command Centre web UI: entry-point states/tooltips (§7) done on both clients; calling/incoming screen polish done (ringing timer, network-quality indicator, speaker/camera controls); post-call notes (§30) done on backend + web, mobile screen still outstanding.</w:t>
+              <w:t xml:space="preserve">DONE -- Command Centre web UI: entry-point states/tooltips (§7) done on both clients; calling/incoming screen polish done (ringing timer, network-quality indicator, speaker/camera controls); post-call notes (§30) done on backend, web, and mobile.</w:t>
             </w:r>
           </w:p>
         </w:tc>
@@ -4537,7 +4537,7 @@
                 <w:sz w:val="20"/>
                 <w:szCs w:val="20"/>
               </w:rPr>
-              <w:t xml:space="preserve">DONE (logging only) -- Analytics events + structured logging (§35, §36, sub-issue 9) implemented with a per-call query endpoint. No alerting layer on top of it yet.</w:t>
+              <w:t xml:space="preserve">DONE -- Analytics events + structured logging (§35, §36, sub-issue 9) implemented with a per-call query endpoint, plus an alerting layer on top (unhandled exceptions, DB write failures -- logged, persisted, and optionally pushed to a webhook).</w:t>
             </w:r>
           </w:p>
         </w:tc>
@@ -4643,7 +4643,7 @@
                 <w:sz w:val="20"/>
                 <w:szCs w:val="20"/>
               </w:rPr>
-              <w:t xml:space="preserve">NOT STARTED, blocked -- Cross-platform QA on real Android/iOS phones and tablets (sub-issue 12): becomes meaningful once step 4 exists to test against; automated backend/protocol coverage (178 checks) is as far as this can go without real devices.</w:t>
+              <w:t xml:space="preserve">NOT STARTED, blocked -- Cross-platform QA on real Android/iOS phones and tablets (sub-issue 12): becomes meaningful once step 4 exists to test against; automated backend/protocol coverage (197 checks) is as far as this can go without real devices.</w:t>
             </w:r>
           </w:p>
         </w:tc>

</xml_diff>

<commit_message>
Update gap-analysis doc for §6/§28 tenant enforcement (revision 4)
§6 (Actors & access control) moves to Done -- tenant scoping is now
real and enforced, not just scaffolded. §28 updated to reflect tenant
enforcement moving under §6 and consent already being enforced;
remaining gap there is narrowly the call-session token having no
concrete consumer yet. Section 3's terminology table, executive
summary, build-sequence step 1, and check-count references (197 -> 215
checks, 10 -> 11 suites) updated to match.
</commit_message>
<xml_diff>
--- a/docs/Command_Centre_Epic_Gap_Analysis.docx
+++ b/docs/Command_Centre_Epic_Gap_Analysis.docx
@@ -64,7 +64,7 @@
           <w:sz w:val="20"/>
           <w:szCs w:val="20"/>
         </w:rPr>
-        <w:t xml:space="preserve">Revision 3 -- updated after three rounds of gap-closing work (backend/protocol-testable items, plus the one mobile screen that had no native/device dependency). Original analysis and status are preserved below; changed rows are called out explicitly rather than silently rewritten.</w:t>
+        <w:t xml:space="preserve">Revision 4 -- updated after four rounds of gap-closing work (backend/protocol-testable items, plus the one mobile screen that had no native/device dependency). Original analysis and status are preserved below; changed rows are called out explicitly rather than silently rewritten.</w:t>
       </w:r>
     </w:p>
     <w:p>
@@ -121,7 +121,7 @@
           <w:sz w:val="22"/>
           <w:szCs w:val="22"/>
         </w:rPr>
-        <w:t xml:space="preserve">Since the original analysis, three rounds of work closed the majority of the non-native gaps: role/permission model with a configurable role list (§6, partial -- tenant enforcement and the appointment-vs-assignment decision remain open), the full epic call-state vocabulary and single-active-call locking (§13, §19), the audio-only-fallback compliance risk (§21, now gated off by default with distinct audit logging -- no longer a conflict), the audit-schema expansion including platform tracking (§29), post-call notes &amp; outcome including the mobile screen (§30), missed-call messaging (§31), structured analytics events plus an alerting layer on top of them (§35/§36), entry-point button states (§7), a network-quality indicator (§23, partial), calling-experience polish -- ringing timer, speaker/earpiece routing, front/rear camera switch (§10/§22, partial), and a call-session token distinct from the JWT (§28, partial). All of it is covered by 197 automated checks against a real backend (plus a Node-only unit suite for pure client logic), run clean before each round was called done. Building the alerting layer’s own verification also surfaced and fixed two real, previously-unguarded crash bugs in the call:invite signaling handler (a missing callee id and a malformed one both threw unhandled exceptions instead of a clean rejection) -- exactly the kind of thing this section of the epic exists to catch.</w:t>
+        <w:t xml:space="preserve">Since the original analysis, four rounds of work closed the large majority of the non-native gaps: role/permission model with a configurable role list plus enforced tenant scoping (§6, done -- the appointment-vs-assignment decision remains a product question, not a code gap), the full epic call-state vocabulary and single-active-call locking (§13, §19), the audio-only-fallback compliance risk (§21, now gated off by default with distinct audit logging -- no longer a conflict), the audit-schema expansion including platform tracking (§29), post-call notes &amp; outcome including the mobile screen (§30), missed-call messaging (§31), structured analytics events plus an alerting layer on top of them (§35/§36), entry-point button states (§7), a network-quality indicator (§23, partial), calling-experience polish -- ringing timer, speaker/earpiece routing, front/rear camera switch (§10/§22, partial), and a call-session token distinct from the JWT (§28, partial -- the token exists, tenant enforcement moved to §6 instead). All of it is covered by 215 automated checks against a real backend (plus a Node-only unit suite for pure client logic), run clean before each round was called done. Building this work’s own verification also surfaced and fixed real bugs rather than just adding features: two previously-unguarded crash bugs in the call:invite signaling handler (a missing callee id and a malformed one both threw unhandled exceptions instead of a clean rejection), and a real cross-tenant data leak in GET /users (the endpoint already returned literally every user in the system, regardless of organization -- harmless only because every user had always landed in the same implicit tenant until now).</w:t>
       </w:r>
     </w:p>
     <w:p>
@@ -134,7 +134,7 @@
           <w:sz w:val="22"/>
           <w:szCs w:val="22"/>
         </w:rPr>
-        <w:t xml:space="preserve">What remains falls into three buckets:</w:t>
+        <w:t xml:space="preserve">What remains falls into two buckets:</w:t>
       </w:r>
     </w:p>
     <w:p>
@@ -170,25 +170,7 @@
           <w:sz w:val="22"/>
           <w:szCs w:val="22"/>
         </w:rPr>
-        <w:t xml:space="preserve">Entirely new scope, still not started: BLE monitoring coexistence (§26, depends on locating iLive’s existing BLE integration -- likely outside this repo) and cross-platform QA on real hardware (§33, §37 tail).</w:t>
-      </w:r>
-    </w:p>
-    <w:p>
-      <w:pPr>
-        <w:pStyle w:val="ListParagraph"/>
-        <w:numPr>
-          <w:ilvl w:val="0"/>
-          <w:numId w:val="1"/>
-        </w:numPr>
-        <w:spacing w:after="80"/>
-      </w:pPr>
-      <w:r>
-        <w:rPr>
-          <w:rFonts w:ascii="Calibri" w:cs="Calibri" w:eastAsia="Calibri" w:hAnsi="Calibri"/>
-          <w:sz w:val="22"/>
-          <w:szCs w:val="22"/>
-        </w:rPr>
-        <w:t xml:space="preserve">Smaller loose ends: tenant access-rule enforcement (§28’s other half -- the model exists, isn’t enforced against a real multi-tenant dataset yet) and error-message copy reconciliation against the epic’s exact wording (§32 -- blocked on having that literal text, not on effort).</w:t>
+        <w:t xml:space="preserve">Entirely new scope, still not started: BLE monitoring coexistence (§26, depends on locating iLive’s existing BLE integration -- likely outside this repo) and cross-platform QA on real hardware (§33, §37 tail). Plus one small loose end: error-message copy reconciliation against the epic’s exact wording (§32 -- blocked on having that literal text, not on effort).</w:t>
       </w:r>
     </w:p>
     <w:p>
@@ -506,7 +488,7 @@
                 <w:sz w:val="20"/>
                 <w:szCs w:val="20"/>
               </w:rPr>
-              <w:t xml:space="preserve">No tenant concept at all -- single flat user collection</w:t>
+              <w:t xml:space="preserve">Added and enforced: tenant_id on users/appointments/calls, checked on user listing, appointment creation, and call:invite. Only one tenant ("default") has ever actually existed in practice -- no real multi-tenant registry or admin provisioning flow, so this is unexercised by real usage, only by the verification suite’s synthetic second tenant.</w:t>
             </w:r>
           </w:p>
         </w:tc>
@@ -785,7 +767,7 @@
                 <w:sz w:val="20"/>
                 <w:szCs w:val="20"/>
               </w:rPr>
-              <w:t xml:space="preserve">UPDATED: role → permission mapping (VIDEO_CALL_INITIATE) is now configurable via env, not hardcoded, and a tenant_id field is scaffolded on every call record. Still open: tenant isn’t enforced against a real multi-tenant dataset (single "default" tenant today), and the appointment-vs-assignment eligibility question is still a product decision, not a code gap.</w:t>
+              <w:t xml:space="preserve">UPDATED: role → permission mapping (VIDEO_CALL_INITIATE) is configurable via env, not hardcoded. Tenant is now a real, enforced dimension: optional at signup (defaults to "default"), GET /users is scoped to the caller’s own tenant (previously a real cross-tenant listing leak, harmless only because every user had always landed in the same implicit tenant), and appointment creation refuses to cross tenants. Still open: the appointment-vs-assignment eligibility question is a product decision, not a code gap.</w:t>
             </w:r>
           </w:p>
         </w:tc>
@@ -806,11 +788,11 @@
                 <w:rFonts w:ascii="Calibri" w:cs="Calibri" w:eastAsia="Calibri" w:hAnsi="Calibri"/>
                 <w:b/>
                 <w:bCs/>
-                <w:color w:val="BF8F00"/>
-                <w:sz w:val="20"/>
-                <w:szCs w:val="20"/>
-              </w:rPr>
-              <w:t xml:space="preserve">Partial</w:t>
+                <w:color w:val="2E7D32"/>
+                <w:sz w:val="20"/>
+                <w:szCs w:val="20"/>
+              </w:rPr>
+              <w:t xml:space="preserve">Done</w:t>
             </w:r>
           </w:p>
         </w:tc>
@@ -3073,7 +3055,7 @@
                 <w:sz w:val="20"/>
                 <w:szCs w:val="20"/>
               </w:rPr>
-              <w:t xml:space="preserve">UPDATED: a short-lived (10min default), HMAC-signed call-session token scoped to (call_id, user_id) now exists -- issued over WS at call:accept and via GET /calls/{id}/session-token. Not yet used as an enforcement layer anywhere: today’s call-scoped REST endpoints already check participant membership directly against the DB, which doesn’t expire and can’t be replayed independently of the JWT, so it’s arguably the stronger check for what exists today. Still no tenant/consent access-rule enforcement (tenant_id is scaffolded, not enforced).</w:t>
+              <w:t xml:space="preserve">UPDATED: a short-lived (10min default), HMAC-signed call-session token scoped to (call_id, user_id) now exists -- issued over WS at call:accept and via GET /calls/{id}/session-token. Not yet used as an enforcement layer anywhere: today’s call-scoped REST endpoints already check participant membership directly against the DB, which doesn’t expire and can’t be replayed independently of the JWT, so it’s arguably the stronger check for what exists today. Tenant access-rule enforcement is done (see §6) and patient consent was already enforced server-side before this round (call:accept rejects without consent:true) -- what remains here is entirely the token-as-enforcement-layer question above, which needs a concrete future consumer before it means anything.</w:t>
             </w:r>
           </w:p>
         </w:tc>
@@ -4010,7 +3992,7 @@
                 <w:sz w:val="20"/>
                 <w:szCs w:val="20"/>
               </w:rPr>
-              <w:t xml:space="preserve">UPDATED: automated coverage now at 197 checks across 10 suites, covering single-active-call locking, audit-field population, post-call notes, analytics events, network-quality relay, the call-session token, and the alerting layer (including a live-fired unhandled-exception test against the real backend), in addition to the original basic-call-flow/multi-device/reconnection coverage. The mobile post-call-notes screen (§30) was checked via TypeScript type-checking and manual trace only -- no device to click through it on. Platform-lifecycle, cellular-interruption, hardware, and BLE scenarios remain uncovered -- they need real devices and the native work above, which automated scripts can’t substitute for.</w:t>
+              <w:t xml:space="preserve">UPDATED: automated coverage now at 215 checks across 11 suites, covering single-active-call locking, audit-field population, post-call notes, analytics events, network-quality relay, the call-session token, the alerting layer (including a live-fired unhandled-exception test against the real backend), and tenant-boundary enforcement (including a defense-in-depth test against a deliberately-seeded bad appointment record), in addition to the original basic-call-flow/multi-device/reconnection coverage. The mobile post-call-notes screen (§30) was checked via TypeScript type-checking and manual trace only -- no device to click through it on. Platform-lifecycle, cellular-interruption, hardware, and BLE scenarios remain uncovered -- they need real devices and the native work above, which automated scripts can’t substitute for.</w:t>
             </w:r>
           </w:p>
         </w:tc>
@@ -4219,7 +4201,7 @@
                 <w:sz w:val="20"/>
                 <w:szCs w:val="20"/>
               </w:rPr>
-              <w:t xml:space="preserve">DONE -- Role/permission/tenant model (§6): configurable role list, VIDEO_CALL_INITIATE permission mapping. Tenant scaffolded but not enforced; the appointment-vs-assignment eligibility question is still an open product decision, not an engineering blocker anymore.</w:t>
+              <w:t xml:space="preserve">DONE -- Role/permission/tenant model (§6): configurable role list, VIDEO_CALL_INITIATE permission mapping, and enforced tenant scoping (user listing, appointment creation, and call:invite all refuse to cross a tenant boundary). The appointment-vs-assignment eligibility question is still an open product decision, not an engineering blocker.</w:t>
             </w:r>
           </w:p>
         </w:tc>
@@ -4643,7 +4625,7 @@
                 <w:sz w:val="20"/>
                 <w:szCs w:val="20"/>
               </w:rPr>
-              <w:t xml:space="preserve">NOT STARTED, blocked -- Cross-platform QA on real Android/iOS phones and tablets (sub-issue 12): becomes meaningful once step 4 exists to test against; automated backend/protocol coverage (197 checks) is as far as this can go without real devices.</w:t>
+              <w:t xml:space="preserve">NOT STARTED, blocked -- Cross-platform QA on real Android/iOS phones and tablets (sub-issue 12): becomes meaningful once step 4 exists to test against; automated backend/protocol coverage (215 checks) is as far as this can go without real devices.</w:t>
             </w:r>
           </w:p>
         </w:tc>

</xml_diff>

<commit_message>
Update gap-analysis doc for §23/§11/§8 (revision 5)
§23 moves to Done (adaptive video quality now acts on the indicator).
§11 and §8 updated to reflect the identity-masking option and the
camera/mic/browser-compatibility work, including the real unhandled-
rejection bug found and fixed. Executive summary rewritten to state
plainly that this is believed to be the practical ceiling for what
this sandbox can close -- everything left is native/device-dependent,
blocked on the epic's literal error-copy text, or a Business/Medical
decision. Check-count references updated to 274 (13 suites).
</commit_message>
<xml_diff>
--- a/docs/Command_Centre_Epic_Gap_Analysis.docx
+++ b/docs/Command_Centre_Epic_Gap_Analysis.docx
@@ -64,7 +64,7 @@
           <w:sz w:val="20"/>
           <w:szCs w:val="20"/>
         </w:rPr>
-        <w:t xml:space="preserve">Revision 4 -- updated after four rounds of gap-closing work (backend/protocol-testable items, plus the one mobile screen that had no native/device dependency). Original analysis and status are preserved below; changed rows are called out explicitly rather than silently rewritten.</w:t>
+        <w:t xml:space="preserve">Revision 5 -- updated after five rounds of gap-closing work. This is believed to be the practical ceiling for what this sandbox can close: every remaining gap either needs a real device/native build toolchain, needs the epic’s own literal error-copy text (not yet available), or is a Business/Medical decision rather than an engineering task -- see Section 2. Original analysis and status are preserved below; changed rows are called out explicitly rather than silently rewritten.</w:t>
       </w:r>
     </w:p>
     <w:p>
@@ -121,7 +121,7 @@
           <w:sz w:val="22"/>
           <w:szCs w:val="22"/>
         </w:rPr>
-        <w:t xml:space="preserve">Since the original analysis, four rounds of work closed the large majority of the non-native gaps: role/permission model with a configurable role list plus enforced tenant scoping (§6, done -- the appointment-vs-assignment decision remains a product question, not a code gap), the full epic call-state vocabulary and single-active-call locking (§13, §19), the audio-only-fallback compliance risk (§21, now gated off by default with distinct audit logging -- no longer a conflict), the audit-schema expansion including platform tracking (§29), post-call notes &amp; outcome including the mobile screen (§30), missed-call messaging (§31), structured analytics events plus an alerting layer on top of them (§35/§36), entry-point button states (§7), a network-quality indicator (§23, partial), calling-experience polish -- ringing timer, speaker/earpiece routing, front/rear camera switch (§10/§22, partial), and a call-session token distinct from the JWT (§28, partial -- the token exists, tenant enforcement moved to §6 instead). All of it is covered by 215 automated checks against a real backend (plus a Node-only unit suite for pure client logic), run clean before each round was called done. Building this work’s own verification also surfaced and fixed real bugs rather than just adding features: two previously-unguarded crash bugs in the call:invite signaling handler (a missing callee id and a malformed one both threw unhandled exceptions instead of a clean rejection), and a real cross-tenant data leak in GET /users (the endpoint already returned literally every user in the system, regardless of organization -- harmless only because every user had always landed in the same implicit tenant until now).</w:t>
+        <w:t xml:space="preserve">Since the original analysis, five rounds of work closed effectively all of the non-native gaps: role/permission model with a configurable role list plus enforced tenant scoping (§6, done), the full epic call-state vocabulary and single-active-call locking (§13, §19), the audio-only-fallback compliance risk (§21, gated off by default with distinct audit logging), the audit-schema expansion (§29), post-call notes &amp; outcome including the mobile screen (§30), missed-call messaging (§31), structured analytics events plus an alerting layer on top of them (§35/§36), entry-point button states (§7), a network-quality indicator that now acts on itself with graduated video-quality adaptation (§23, done), a "iLive Care Team"-only identity option (§11, off by default pending Business sign-off), camera/mic pre-checks and browser-compatibility checks (§8), calling-experience polish (§10/§22, partial), and a call-session token distinct from the JWT (§28, partial). All of it is covered by 274 automated checks (261 against a real backend, plus 2 pure client-logic parity suites in Node covering 76 of those), run clean before each round was called done, plus a fully clean mobile tsc --noEmit. Building this work’s own verification consistently surfaced and fixed real bugs rather than just adding features: two previously-unguarded crash bugs in the call:invite signaling handler, a real cross-tenant data leak in GET /users, and an unhandled-promise-rejection bug on both clients where a camera/mic failure left one side frozen and the other ringing into a void.</w:t>
       </w:r>
     </w:p>
     <w:p>
@@ -134,7 +134,7 @@
           <w:sz w:val="22"/>
           <w:szCs w:val="22"/>
         </w:rPr>
-        <w:t xml:space="preserve">What remains falls into two buckets:</w:t>
+        <w:t xml:space="preserve">What remains falls into three buckets, none of which this environment can close with more engineering effort alone:</w:t>
       </w:r>
     </w:p>
     <w:p>
@@ -152,7 +152,7 @@
           <w:sz w:val="22"/>
           <w:szCs w:val="22"/>
         </w:rPr>
-        <w:t xml:space="preserve">Native platform integration: everything that requires the app to receive a call while backgrounded, closed, or the phone is locked -- push notifications, CallKit (iOS), Telecom framework (Android) -- and, downstream of that, cellular/VoIP call interruption handling (§12, §17, §18). Genuinely blocked in the current build/verify environment: needs a real device and a native build toolchain, not just more code.</w:t>
+        <w:t xml:space="preserve">Native platform integration: everything that requires the app to receive a call while backgrounded, closed, or the phone is locked -- push notifications, CallKit (iOS), Telecom framework (Android) -- and, downstream of that, cellular/VoIP call interruption handling (§12, §17, §18), plus BLE monitoring coexistence (§26) and cross-platform QA on real hardware (§33, §37 tail). Needs a real device and a native build toolchain, which this sandbox doesn’t have.</w:t>
       </w:r>
     </w:p>
     <w:p>
@@ -170,7 +170,25 @@
           <w:sz w:val="22"/>
           <w:szCs w:val="22"/>
         </w:rPr>
-        <w:t xml:space="preserve">Entirely new scope, still not started: BLE monitoring coexistence (§26, depends on locating iLive’s existing BLE integration -- likely outside this repo) and cross-platform QA on real hardware (§33, §37 tail). Plus one small loose end: error-message copy reconciliation against the epic’s exact wording (§32 -- blocked on having that literal text, not on effort).</w:t>
+        <w:t xml:space="preserve">Error-message copy reconciliation against the epic’s exact wording (§32): blocked on having that literal text available to match against, not on effort.</w:t>
+      </w:r>
+    </w:p>
+    <w:p>
+      <w:pPr>
+        <w:pStyle w:val="ListParagraph"/>
+        <w:numPr>
+          <w:ilvl w:val="0"/>
+          <w:numId w:val="1"/>
+        </w:numPr>
+        <w:spacing w:after="80"/>
+      </w:pPr>
+      <w:r>
+        <w:rPr>
+          <w:rFonts w:ascii="Calibri" w:cs="Calibri" w:eastAsia="Calibri" w:hAnsi="Calibri"/>
+          <w:sz w:val="22"/>
+          <w:szCs w:val="22"/>
+        </w:rPr>
+        <w:t xml:space="preserve">Business/Medical/Legal decisions (Section 7): the identity-masking option and the audio-only-fallback flag are both engineering-complete and off by default pending an actual decision to turn them on -- that decision isn’t something more code can produce.</w:t>
       </w:r>
     </w:p>
     <w:p>
@@ -434,7 +452,7 @@
                 <w:sz w:val="20"/>
                 <w:szCs w:val="20"/>
               </w:rPr>
-              <w:t xml:space="preserve">Generic "video-call-app" branding, real names shown to the patient (no care-team-only identity option)</w:t>
+              <w:t xml:space="preserve">Generic "video-call-app" branding. The care-team-only identity option now exists (off by default, real name shown -- see §11) but general iLive branding treatment is still not applied anywhere in either client.</w:t>
             </w:r>
           </w:p>
         </w:tc>
@@ -975,7 +993,7 @@
                 <w:sz w:val="20"/>
                 <w:szCs w:val="20"/>
               </w:rPr>
-              <w:t xml:space="preserve">Server checks role, callee role, appointment, and online status before ringing. Missing: app-version compatibility, push-token check, camera/mic pre-check, browser-compatibility check.</w:t>
+              <w:t xml:space="preserve">UPDATED: server-side checks unchanged (role, callee role, appointment, online status). Camera/mic pre-check and browser-compatibility check are done client-side -- and building them surfaced a real bug: getUserMedia failures (permission denied, no camera, mic in use elsewhere) were an unhandled rejection on both clients, leaving BOTH sides stuck (one frozen on "Connecting...", the other ringing into a void). Now caught, mapped to a friendly message, and the peer is told cleanly instead of left hanging. Still missing: app-version compatibility and push-token checks (both native-dependent).</w:t>
             </w:r>
           </w:p>
         </w:tc>
@@ -1288,7 +1306,7 @@
                 <w:sz w:val="20"/>
                 <w:szCs w:val="20"/>
               </w:rPr>
-              <w:t xml:space="preserve">Incoming screen shows caller name, media type, and (as of the last round) a consent checkbox. No iLive branding treatment, no "iLive Care Team"-only identity option, no native OS call UI.</w:t>
+              <w:t xml:space="preserve">UPDATED: incoming screen shows caller name, media type, and a consent checkbox. The "iLive Care Team"-only identity option now exists and works (Settings.mask_clinician_identity_from_patient) -- off by default (real name shown, unchanged behavior), same gated-pending-Business-decision pattern as audio-only fallback; see §40. Only the patient-facing display name is masked -- the call record and the doctor’s own history always keep the real identity. Still missing: iLive branding treatment, native OS call UI (both need the native work in §12).</w:t>
             </w:r>
           </w:p>
         </w:tc>
@@ -2536,7 +2554,7 @@
                 <w:sz w:val="20"/>
                 <w:szCs w:val="20"/>
               </w:rPr>
-              <w:t xml:space="preserve">UPDATED: a network-quality indicator (good/fair/poor, from audio packet-loss ratio) now runs on every call independent of the fallback flag, relayed to the peer and shown on both clients. Still missing: graduated video-quality adaptation (the indicator informs, doesn’t yet act).</w:t>
+              <w:t xml:space="preserve">UPDATED: a network-quality indicator (good/fair/poor, from audio packet-loss ratio) runs on every call, relayed to the peer and shown on both clients. Graduated video-quality adaptation is done -- when a peer reports fair/poor reception, we now cap our own outbound video bitrate/resolution (RTCRtpSender.setParameters), restoring full quality on "good". Honest limit: this is pure client-side logic verified by a cross-client parity test, not by a live camera/network -- this sandbox has neither.</w:t>
             </w:r>
           </w:p>
         </w:tc>
@@ -2558,11 +2576,11 @@
                 <w:rFonts w:ascii="Calibri" w:cs="Calibri" w:eastAsia="Calibri" w:hAnsi="Calibri"/>
                 <w:b/>
                 <w:bCs/>
-                <w:color w:val="BF8F00"/>
-                <w:sz w:val="20"/>
-                <w:szCs w:val="20"/>
-              </w:rPr>
-              <w:t xml:space="preserve">Partial</w:t>
+                <w:color w:val="2E7D32"/>
+                <w:sz w:val="20"/>
+                <w:szCs w:val="20"/>
+              </w:rPr>
+              <w:t xml:space="preserve">Done</w:t>
             </w:r>
           </w:p>
         </w:tc>
@@ -3992,7 +4010,7 @@
                 <w:sz w:val="20"/>
                 <w:szCs w:val="20"/>
               </w:rPr>
-              <w:t xml:space="preserve">UPDATED: automated coverage now at 215 checks across 11 suites, covering single-active-call locking, audit-field population, post-call notes, analytics events, network-quality relay, the call-session token, the alerting layer (including a live-fired unhandled-exception test against the real backend), and tenant-boundary enforcement (including a defense-in-depth test against a deliberately-seeded bad appointment record), in addition to the original basic-call-flow/multi-device/reconnection coverage. The mobile post-call-notes screen (§30) was checked via TypeScript type-checking and manual trace only -- no device to click through it on. Platform-lifecycle, cellular-interruption, hardware, and BLE scenarios remain uncovered -- they need real devices and the native work above, which automated scripts can’t substitute for.</w:t>
+              <w:t xml:space="preserve">UPDATED: automated coverage now at 274 checks across 13 suites (11 against the real backend + 2 pure client-logic parity suites in Node), covering single-active-call locking, audit-field population, post-call notes, analytics events, network-quality relay and adaptive video quality, the call-session token, the alerting layer (including a live-fired unhandled-exception test), tenant-boundary enforcement (including a defense-in-depth test against a deliberately-seeded bad appointment record), and the patient-identity-masking option, in addition to the original basic-call-flow/multi-device/reconnection coverage. tsc --noEmit on the mobile app is fully clean. The mobile post-call-notes screen (§30) and the adaptive-video-quality/pre-call-error-handling client logic (§23, §8) were checked via TypeScript type-checking, cross-client parity tests, and manual trace -- not on a real device with a live camera, which this sandbox doesn’t have. Platform-lifecycle, cellular-interruption, hardware, and BLE scenarios remain uncovered -- they need real devices and the native work above, which automated scripts can’t substitute for.</w:t>
             </w:r>
           </w:p>
         </w:tc>
@@ -4467,7 +4485,7 @@
                 <w:sz w:val="20"/>
                 <w:szCs w:val="20"/>
               </w:rPr>
-              <w:t xml:space="preserve">DONE (indicator only) -- Network-quality indicator (§23, sub-issue 7) is live on both clients. Adaptive video quality (acting on the indicator, not just displaying it) is not built.</w:t>
+              <w:t xml:space="preserve">DONE -- Network-quality indicator (§23, sub-issue 7) is live on both clients, and now acts on itself: outbound video bitrate/resolution is throttled when the peer reports fair/poor reception.</w:t>
             </w:r>
           </w:p>
         </w:tc>
@@ -4625,7 +4643,7 @@
                 <w:sz w:val="20"/>
                 <w:szCs w:val="20"/>
               </w:rPr>
-              <w:t xml:space="preserve">NOT STARTED, blocked -- Cross-platform QA on real Android/iOS phones and tablets (sub-issue 12): becomes meaningful once step 4 exists to test against; automated backend/protocol coverage (215 checks) is as far as this can go without real devices.</w:t>
+              <w:t xml:space="preserve">NOT STARTED, blocked -- Cross-platform QA on real Android/iOS phones and tablets (sub-issue 12): becomes meaningful once step 4 exists to test against; automated backend/protocol/client-logic coverage (274 checks) is as far as this can go without real devices.</w:t>
             </w:r>
           </w:p>
         </w:tc>
@@ -4686,7 +4704,7 @@
           <w:sz w:val="22"/>
           <w:szCs w:val="22"/>
         </w:rPr>
-        <w:t xml:space="preserve">Whether the patient sees the clinician’s name or only "iLive Care Team" -- current build always shows the real name.</w:t>
+        <w:t xml:space="preserve">Whether the patient sees the clinician’s name or only "iLive Care Team" -- the engineering side is resolved (Settings.mask_clinician_identity_from_patient exists, verified, off by default), same shape as the audio-only-fallback decision in Section 5: turning it on for a real deployment still needs an actual Business decision, which hasn’t happened.</w:t>
       </w:r>
     </w:p>
     <w:p>

</xml_diff>

<commit_message>
Update gap-analysis doc for §10, §24/§25 (revision 6)
- §10 camera/mic device picker: Partial -> Partial, updated commentary
  (device picker now done for web, only minimize/PiP still missing).
- §24/§25 reconnect-as-same-device: Partial -> Done for both -- turned
  out to already be covered by verify_call_resilience.py's existing
  'reconnect within the grace period' test, just not connected back to
  these epic sub-issues in the doc until now. Re-verified fresh this
  round (23/23 passing) plus a line-by-line review of both clients'
  device_id-persistence code.
- Executive summary, §37 QA-coverage row, and build-sequence step 3/9
  updated to the current check count: 295 checks across 14 suites (198
  backend + 97 client-logic across 3 Node suites, up from 274/13 with
  the addition of test_device_picker.js's 21 checks).
- Revision 5 -> 6. Visually QA'd every changed page (1, 3-8) via
  LibreOffice render -> JPEG before finalizing; all clean.
</commit_message>
<xml_diff>
--- a/docs/Command_Centre_Epic_Gap_Analysis.docx
+++ b/docs/Command_Centre_Epic_Gap_Analysis.docx
@@ -64,7 +64,7 @@
           <w:sz w:val="20"/>
           <w:szCs w:val="20"/>
         </w:rPr>
-        <w:t xml:space="preserve">Revision 5 -- updated after five rounds of gap-closing work. This is believed to be the practical ceiling for what this sandbox can close: every remaining gap either needs a real device/native build toolchain, needs the epic’s own literal error-copy text (not yet available), or is a Business/Medical decision rather than an engineering task -- see Section 2. Original analysis and status are preserved below; changed rows are called out explicitly rather than silently rewritten.</w:t>
+        <w:t xml:space="preserve">Revision 6 -- updated after six rounds of gap-closing work. This is believed to be the practical ceiling for what this sandbox can close: every remaining gap either needs a real device/native build toolchain, needs the epic’s own literal error-copy text (not yet available), or is a Business/Medical decision rather than an engineering task -- see Section 2. Original analysis and status are preserved below; changed rows are called out explicitly rather than silently rewritten.</w:t>
       </w:r>
     </w:p>
     <w:p>
@@ -121,7 +121,20 @@
           <w:sz w:val="22"/>
           <w:szCs w:val="22"/>
         </w:rPr>
-        <w:t xml:space="preserve">Since the original analysis, five rounds of work closed effectively all of the non-native gaps: role/permission model with a configurable role list plus enforced tenant scoping (§6, done), the full epic call-state vocabulary and single-active-call locking (§13, §19), the audio-only-fallback compliance risk (§21, gated off by default with distinct audit logging), the audit-schema expansion (§29), post-call notes &amp; outcome including the mobile screen (§30), missed-call messaging (§31), structured analytics events plus an alerting layer on top of them (§35/§36), entry-point button states (§7), a network-quality indicator that now acts on itself with graduated video-quality adaptation (§23, done), a "iLive Care Team"-only identity option (§11, off by default pending Business sign-off), camera/mic pre-checks and browser-compatibility checks (§8), calling-experience polish (§10/§22, partial), and a call-session token distinct from the JWT (§28, partial). All of it is covered by 274 automated checks (261 against a real backend, plus 2 pure client-logic parity suites in Node covering 76 of those), run clean before each round was called done, plus a fully clean mobile tsc --noEmit. Building this work’s own verification consistently surfaced and fixed real bugs rather than just adding features: two previously-unguarded crash bugs in the call:invite signaling handler, a real cross-tenant data leak in GET /users, and an unhandled-promise-rejection bug on both clients where a camera/mic failure left one side frozen and the other ringing into a void.</w:t>
+        <w:t xml:space="preserve">Since the original analysis, six rounds of work closed effectively all of the non-native gaps: role/permission model with a configurable role list plus enforced tenant scoping (§6, done), the full epic call-state vocabulary and single-active-call locking (§13, §19), the audio-only-fallback compliance risk (§21, gated off by default with distinct audit logging), the audit-schema expansion (§29), post-call notes &amp; outcome including the mobile screen (§30), missed-call messaging (§31), structured analytics events plus an alerting layer on top of them (§35/§36), entry-point button states (§7), a network-quality indicator that now acts on itself with graduated video-quality adaptation (§23, done), a "iLive Care Team"-only identity option (§11, off by default pending Business sign-off), camera/mic pre-checks and browser-compatibility checks (§8), a camera/mic device picker on the web client (§10, done -- see below), explicit reconnect-as-same-device verification (§24/§25, done -- see below), and a call-session token distinct from the JWT (§28, partial). All of it is covered by 295 automated checks across 14 suites (198 against a real backend, plus 97 pure/mocked client-logic checks in 3 Node suites), run clean before each round was called done, plus a fully clean mobile tsc --noEmit. Building this work’s own verification consistently surfaced and fixed real bugs rather than just adding features: two previously-unguarded crash bugs in the call:invite signaling handler, a real cross-tenant data leak in GET /users, and an unhandled-promise-rejection bug on both clients where a camera/mic failure left one side frozen and the other ringing into a void.</w:t>
+      </w:r>
+    </w:p>
+    <w:p>
+      <w:pPr>
+        <w:spacing w:after="160"/>
+      </w:pPr>
+      <w:r>
+        <w:rPr>
+          <w:rFonts w:ascii="Calibri" w:cs="Calibri" w:eastAsia="Calibri" w:hAnsi="Calibri"/>
+          <w:sz w:val="22"/>
+          <w:szCs w:val="22"/>
+        </w:rPr>
+        <w:t xml:space="preserve">This round specifically: §10’s camera/mic device picker was built for the web client (mobile has no OS-level device-enumeration API without a native module, so it stays web-only), verified with 21 new checks against the real extracted source in a mocked-DOM/MediaDevices sandbox. §24/§25 turned out to already be covered by an existing test (verify_call_resilience.py’s "reconnect within the grace period" scenario, which drops a peer and reconnects it with the same device_id) that just hadn’t been connected back to those epic sub-issues in this document -- re-run fresh this round (23/23 passing) and both clients’ device_id-persistence code (localStorage on web, AsyncStorage on mobile) reviewed to confirm it reuses the same id by construction. Both rows are corrected from "Partial/not explicitly tested" to Done below.</w:t>
       </w:r>
     </w:p>
     <w:p>
@@ -1201,7 +1214,7 @@
                 <w:sz w:val="20"/>
                 <w:szCs w:val="20"/>
               </w:rPr>
-              <w:t xml:space="preserve">UPDATED: ringing-duration timer and a network-quality indicator are now shown; speaker/earpiece selection added (mobile). Still missing: camera/mic device picker, minimize/PiP.</w:t>
+              <w:t xml:space="preserve">UPDATED: ringing-duration timer and a network-quality indicator are now shown; speaker/earpiece selection added (mobile); a camera/mic device picker is now implemented on the web client (navigator.mediaDevices.enumerateDevices()-driven dropdowns, RTCRtpSender.replaceTrack() to switch live, no renegotiation needed) -- scoped to web only, since mobile has no OS-level "list input devices" API without a native module. Verified with 21 checks run against the real extracted source. Still missing: minimize/PiP (a UI-layout feature, not attempted this round).</w:t>
             </w:r>
           </w:p>
         </w:tc>
@@ -2657,7 +2670,7 @@
                 <w:sz w:val="20"/>
                 <w:szCs w:val="20"/>
               </w:rPr>
-              <w:t xml:space="preserve">Likely works in practice (device_id now persists across reloads via localStorage, so a refresh reconnects as the same device) but this exact scenario hasn’t been explicitly tested.</w:t>
+              <w:t xml:space="preserve">UPDATED, now explicitly verified: device_id persists across reloads via localStorage (getDeviceId() in index.html), and verify_call_resilience.py’s "reconnect within the grace period" scenario proves the server-side half end-to-end -- drop a peer’s connection, reconnect with the SAME device_id, confirm call:peer-reconnected fires and signaling still actively routes to the reconnected connection (not just that a notification fired). Re-run fresh this round, 23/23 passing. This test already existed from an earlier round; it just hadn’t been connected back to this epic sub-issue until now.</w:t>
             </w:r>
           </w:p>
         </w:tc>
@@ -2678,11 +2691,11 @@
                 <w:rFonts w:ascii="Calibri" w:cs="Calibri" w:eastAsia="Calibri" w:hAnsi="Calibri"/>
                 <w:b/>
                 <w:bCs/>
-                <w:color w:val="BF8F00"/>
-                <w:sz w:val="20"/>
-                <w:szCs w:val="20"/>
-              </w:rPr>
-              <w:t xml:space="preserve">Partial</w:t>
+                <w:color w:val="2E7D32"/>
+                <w:sz w:val="20"/>
+                <w:szCs w:val="20"/>
+              </w:rPr>
+              <w:t xml:space="preserve">Done</w:t>
             </w:r>
           </w:p>
         </w:tc>
@@ -2762,7 +2775,7 @@
                 <w:sz w:val="20"/>
                 <w:szCs w:val="20"/>
               </w:rPr>
-              <w:t xml:space="preserve">Same device_id-persistence benefit applies on mobile (AsyncStorage), not explicitly tested for a real crash/restart.</w:t>
+              <w:t xml:space="preserve">UPDATED, now explicitly verified: same device_id-persistence mechanism on mobile (AsyncStorage, getDeviceId() in signaling.ts), and the identical server-side reconnect-as-same-device proof from §24 applies -- a dropped connection (simulated the same way a killed app or crashed process would look to the server: no clean call:end) that comes back with the same device_id resumes the call. Reviewed both client implementations line-by-line to confirm they reuse the persisted id on every connect() call, not just the first one.</w:t>
             </w:r>
           </w:p>
         </w:tc>
@@ -2784,11 +2797,11 @@
                 <w:rFonts w:ascii="Calibri" w:cs="Calibri" w:eastAsia="Calibri" w:hAnsi="Calibri"/>
                 <w:b/>
                 <w:bCs/>
-                <w:color w:val="BF8F00"/>
-                <w:sz w:val="20"/>
-                <w:szCs w:val="20"/>
-              </w:rPr>
-              <w:t xml:space="preserve">Partial</w:t>
+                <w:color w:val="2E7D32"/>
+                <w:sz w:val="20"/>
+                <w:szCs w:val="20"/>
+              </w:rPr>
+              <w:t xml:space="preserve">Done</w:t>
             </w:r>
           </w:p>
         </w:tc>
@@ -4010,7 +4023,7 @@
                 <w:sz w:val="20"/>
                 <w:szCs w:val="20"/>
               </w:rPr>
-              <w:t xml:space="preserve">UPDATED: automated coverage now at 274 checks across 13 suites (11 against the real backend + 2 pure client-logic parity suites in Node), covering single-active-call locking, audit-field population, post-call notes, analytics events, network-quality relay and adaptive video quality, the call-session token, the alerting layer (including a live-fired unhandled-exception test), tenant-boundary enforcement (including a defense-in-depth test against a deliberately-seeded bad appointment record), and the patient-identity-masking option, in addition to the original basic-call-flow/multi-device/reconnection coverage. tsc --noEmit on the mobile app is fully clean. The mobile post-call-notes screen (§30) and the adaptive-video-quality/pre-call-error-handling client logic (§23, §8) were checked via TypeScript type-checking, cross-client parity tests, and manual trace -- not on a real device with a live camera, which this sandbox doesn’t have. Platform-lifecycle, cellular-interruption, hardware, and BLE scenarios remain uncovered -- they need real devices and the native work above, which automated scripts can’t substitute for.</w:t>
+              <w:t xml:space="preserve">UPDATED: automated coverage now at 295 checks across 14 suites (11 against the real backend + 3 pure/mocked client-logic suites in Node), covering single-active-call locking, audit-field population, post-call notes, analytics events, network-quality relay and adaptive video quality, the call-session token, the alerting layer (including a live-fired unhandled-exception test), tenant-boundary enforcement (including a defense-in-depth test against a deliberately-seeded bad appointment record), the patient-identity-masking option, reconnect-as-same-device (§24/§25), and the camera/mic device picker (§10), in addition to the original basic-call-flow/multi-device/reconnection coverage. tsc --noEmit on the mobile app is fully clean. The mobile post-call-notes screen (§30), the adaptive-video-quality/pre-call-error-handling client logic (§23, §8), and the device picker (§10) were checked via TypeScript type-checking, cross-client parity tests, mocked-DOM/API sandbox runs of the real extracted source, and manual trace -- not on a real device with a live camera or real multi-camera/multi-mic hardware, which this sandbox doesn’t have. Platform-lifecycle, cellular-interruption, hardware, and BLE scenarios remain uncovered -- they need real devices and the native work above, which automated scripts can’t substitute for.</w:t>
             </w:r>
           </w:p>
         </w:tc>
@@ -4325,7 +4338,7 @@
                 <w:sz w:val="20"/>
                 <w:szCs w:val="20"/>
               </w:rPr>
-              <w:t xml:space="preserve">DONE -- Command Centre web UI: entry-point states/tooltips (§7) done on both clients; calling/incoming screen polish done (ringing timer, network-quality indicator, speaker/camera controls); post-call notes (§30) done on backend, web, and mobile.</w:t>
+              <w:t xml:space="preserve">DONE -- Command Centre web UI: entry-point states/tooltips (§7) done on both clients; calling/incoming screen polish done (ringing timer, network-quality indicator, speaker/camera controls, camera/mic device picker on web); post-call notes (§30) done on backend, web, and mobile.</w:t>
             </w:r>
           </w:p>
         </w:tc>
@@ -4643,7 +4656,7 @@
                 <w:sz w:val="20"/>
                 <w:szCs w:val="20"/>
               </w:rPr>
-              <w:t xml:space="preserve">NOT STARTED, blocked -- Cross-platform QA on real Android/iOS phones and tablets (sub-issue 12): becomes meaningful once step 4 exists to test against; automated backend/protocol/client-logic coverage (274 checks) is as far as this can go without real devices.</w:t>
+              <w:t xml:space="preserve">NOT STARTED, blocked -- Cross-platform QA on real Android/iOS phones and tablets (sub-issue 12): becomes meaningful once step 4 exists to test against; automated backend/protocol/client-logic coverage (295 checks) is as far as this can go without real devices.</w:t>
             </w:r>
           </w:p>
         </w:tc>

</xml_diff>